<commit_message>
Android: make device play a first-class launch choice
</commit_message>
<xml_diff>
--- a/Documentation/User Manual/TurnHub Manual V0.12.docx
+++ b/Documentation/User Manual/TurnHub Manual V0.12.docx
@@ -1337,28 +1337,7 @@
         <w:pStyle w:val="NormalWeb"/>
       </w:pPr>
       <w:r>
-        <w:rPr/>
-        <w:t xml:space="preserve">The TurnHub Android app is on Google Play. While TurnHub is a prototype it is offered through Google Play’s testing track, so the owner adds you as a tester first. The app joins the TurnHub-Atlas Wi-Fi by itself: tap </w:t>
-      </w:r>
-      <w:r>
-        <w:rPr>
-          <w:b/>
-        </w:rPr>
-        <w:t>Connect to Atlas</w:t>
-      </w:r>
-      <w:r>
-        <w:rPr/>
-        <w:t xml:space="preserve">. It tries the saved password, then TurnHub-Setup, and asks only if neither works. On newer Android versions, allow </w:t>
-      </w:r>
-      <w:r>
-        <w:rPr>
-          <w:b/>
-        </w:rPr>
-        <w:t>Nearby devices</w:t>
-      </w:r>
-      <w:r>
-        <w:rPr/>
-        <w:t xml:space="preserve"> when asked; without it the app cannot reach Atlas.</w:t>
+        <w:t>The TurnHub Android app is on Google Play. While TurnHub is a prototype it is offered through Google Play’s testing track, so the owner adds you as a tester first. Choose Play on this device for a local game (section 18), or Connect to Atlas to join a table. The app joins the TurnHub-Atlas Wi-Fi by itself. It tries the saved password, then TurnHub-Setup, and asks only if neither works. On newer Android versions, allow Nearby devices when you choose an Atlas action; local play needs no nearby-device permission.</w:t>
       </w:r>
     </w:p>
     <w:p>
@@ -5224,18 +5203,25 @@
         <w:pStyle w:val="NormalWeb"/>
       </w:pPr>
       <w:r>
-        <w:rPr/>
-        <w:t xml:space="preserve">With no Atlas at the table, the Android app can keep a simple game on its own. Tap </w:t>
+        <w:t xml:space="preserve">The Android app can keep a game on this phone or tablet with no Atlas, account or network. Tap </w:t>
       </w:r>
       <w:r>
         <w:rPr>
           <w:b/>
         </w:rPr>
-        <w:t>Play without Atlas</w:t>
-      </w:r>
-      <w:r>
-        <w:rPr/>
-        <w:t xml:space="preserve"> on the first screen. It is there whenever the app is not connected, including while it is still looking for Atlas.</w:t>
+        <w:t>Play on this device</w:t>
+      </w:r>
+      <w:r>
+        <w:t xml:space="preserve"> on the first screen, or </w:t>
+      </w:r>
+      <w:r>
+        <w:rPr>
+          <w:b/>
+        </w:rPr>
+        <w:t>Resume game</w:t>
+      </w:r>
+      <w:r>
+        <w:t xml:space="preserve"> if a local match is running or paused. Local play is available while the app is looking for Atlas; choosing it stops that connection attempt. The app remembers device play for its next launch. Back returns to the connection screen without ending the local game; an explicit Atlas connection, search or setup chooses Atlas for future launches.</w:t>
       </w:r>
     </w:p>
     <w:p>
@@ -5311,8 +5297,7 @@
         <w:pStyle w:val="NormalWeb"/>
       </w:pPr>
       <w:r>
-        <w:rPr/>
-        <w:t>The device keeps each finished game. The next time the app connects to an Atlas (firmware 0.7.1 or later) and someone is signed in, it sends the finished games, and Atlas adds them to the statistics of the players it recognizes. Atlas counts each game only once, however often it is sent. Players who were typed in with no matching account are not counted.</w:t>
+        <w:t>This device saves the current game when you close the app. Finished game records form a queue for optional Atlas import, capped at the newest 200 records. When the app connects to an Atlas (firmware 0.7.1 or later) and someone is signed in, it sends these records, and Atlas adds recognized players to their statistics. Atlas counts each game only once, however often it is sent. Players typed in with no matching account are not counted. Imported records and records Atlas rejects as invalid leave the queue; a permanent local history is still planned.</w:t>
       </w:r>
     </w:p>
     <w:p>

</xml_diff>

<commit_message>
Android: retain local players and match history independently of import
</commit_message>
<xml_diff>
--- a/Documentation/User Manual/TurnHub Manual V0.12.docx
+++ b/Documentation/User Manual/TurnHub Manual V0.12.docx
@@ -5236,39 +5236,28 @@
         </w:rPr>
       </w:pPr>
       <w:r>
-        <w:rPr/>
-        <w:t xml:space="preserve">Add everyone who is playing. Type a name, or pick from </w:t>
+        <w:t>Add everyone who is playing. Type a name to create a local player, or pick a saved player from this device. Short IDs distinguish people with equal names; names never select Atlas accounts automatically.</w:t>
+      </w:r>
+    </w:p>
+    <w:p>
+      <w:pPr>
+        <w:numPr>
+          <w:ilvl w:val="0"/>
+          <w:numId w:val="1"/>
+        </w:numPr>
+        <w:spacing w:before="100" w:beforeAutospacing="1" w:after="100" w:afterAutospacing="1" w:line="240" w:lineRule="auto"/>
+        <w:rPr>
+          <w:rFonts w:eastAsia="Times New Roman"/>
+        </w:rPr>
+      </w:pPr>
+      <w:r>
+        <w:rPr/>
+        <w:t xml:space="preserve">Use the arrows to set turn order, choose the game and starting life, and tap </w:t>
       </w:r>
       <w:r>
         <w:rPr>
           <w:b/>
         </w:rPr>
-        <w:t>Players from your Atlas</w:t>
-      </w:r>
-      <w:r>
-        <w:rPr/>
-        <w:t>: the app remembers the players of the last Atlas it connected to. A typed name that matches one of them becomes that player.</w:t>
-      </w:r>
-    </w:p>
-    <w:p>
-      <w:pPr>
-        <w:numPr>
-          <w:ilvl w:val="0"/>
-          <w:numId w:val="1"/>
-        </w:numPr>
-        <w:spacing w:before="100" w:beforeAutospacing="1" w:after="100" w:afterAutospacing="1" w:line="240" w:lineRule="auto"/>
-        <w:rPr>
-          <w:rFonts w:eastAsia="Times New Roman"/>
-        </w:rPr>
-      </w:pPr>
-      <w:r>
-        <w:rPr/>
-        <w:t xml:space="preserve">Use the arrows to set turn order, choose the game and starting life, and tap </w:t>
-      </w:r>
-      <w:r>
-        <w:rPr>
-          <w:b/>
-        </w:rPr>
         <w:t>Start the game</w:t>
       </w:r>
       <w:r>
@@ -5297,7 +5286,7 @@
         <w:pStyle w:val="NormalWeb"/>
       </w:pPr>
       <w:r>
-        <w:t>This device saves the current game when you close the app. Finished game records form a queue for optional Atlas import, capped at the newest 200 records. When the app connects to an Atlas (firmware 0.7.1 or later) and someone is signed in, it sends these records, and Atlas adds recognized players to their statistics. Atlas counts each game only once, however often it is sent. Players typed in with no matching account are not counted. Imported records and records Atlas rejects as invalid leave the queue; a permanent local history is still planned.</w:t>
+        <w:t>This device saves the current game and reusable local players when you close the app. Add creates a new player, even if another player has the same name; pick a saved player to reuse their identity. Device players and history on Home, or Players and history in the local lobby, shows finished matches and each local player’s played, won and draw totals. History has no automatic pruning and stays after import or rejection. Clearing app data or uninstalling removes it; export/backup is not available yet. Older queued records are kept without guessing their player identities. Automatic Atlas import is temporarily paused while explicit player linking is added.</w:t>
       </w:r>
     </w:p>
     <w:p>
@@ -6177,8 +6166,7 @@
         </w:rPr>
       </w:pPr>
       <w:r>
-        <w:rPr/>
-        <w:t>Games played without Atlas count once the app hands them to Atlas (section 18).</w:t>
+        <w:t>Games played on this device have their own local history and totals (section 18), separate from Atlas statistics.</w:t>
       </w:r>
     </w:p>
     <w:p>
@@ -7273,8 +7261,7 @@
         <w:pStyle w:val="NormalWeb"/>
       </w:pPr>
       <w:r>
-        <w:rPr/>
-        <w:t>Connect the app that kept the game to Atlas (firmware 0.7.1 or later) and sign in; it sends finished games then. Only players matched to an account on that Atlas are counted.</w:t>
+        <w:t>Device players and history shows local results. Atlas import is temporarily paused while explicit linking is added; no same-name account is selected automatically.</w:t>
       </w:r>
     </w:p>
     <w:p>

</xml_diff>

<commit_message>
Require explicit Atlas-scoped mappings and retain import outcomes
</commit_message>
<xml_diff>
--- a/Documentation/User Manual/TurnHub Manual V0.12.docx
+++ b/Documentation/User Manual/TurnHub Manual V0.12.docx
@@ -5282,11 +5282,16 @@
       </w:r>
     </w:p>
     <w:p>
-      <w:pPr>
-        <w:pStyle w:val="NormalWeb"/>
-      </w:pPr>
-      <w:r>
-        <w:t>This device saves the current game and reusable local players when you close the app. Add creates a new player, even if another player has the same name; pick a saved player to reuse their identity. Device players and history on Home, or Players and history in the local lobby, shows finished matches and each local player’s played, won and draw totals. History has no automatic pruning and stays after import or rejection. Clearing app data or uninstalling removes it; export/backup is not available yet. Older queued records are kept without guessing their player identities. Automatic Atlas import is temporarily paused while explicit player linking is added.</w:t>
+      <w:r>
+        <w:t>Atlas import is optional (firmware 0.7.2 or later). Connect and sign in, open Device players and history, then Load Atlas players for import. For a match, choose Link this match for Atlas import and explicitly pick a different Atlas profile for every player. Nothing is selected by name. Check the destination Atlas ID and all player choices, then Import mapped match. Local players and match results stay on this device. History shows pending, imported or needs-attention status and the response reason. Retry a pending import with the same mapping after reconnecting; review a rejected match before explicitly linking it again. The app never automatically resends an imported match. Atlas remembers only its last 64 import IDs, and storage failures or power loss can leave partial credit; acknowledged partial credit is shown and must be reviewed rather than blindly replayed.</w:t>
+      </w:r>
+    </w:p>
+    <w:p>
+      <w:pPr>
+        <w:pStyle w:val="NormalWeb"/>
+      </w:pPr>
+      <w:r>
+        <w:t>This device saves the current game and reusable local players when you close the app. Device players and history on Home, or Players and history in the local lobby, shows finished matches and each local player’s played, won and draw totals. History has no automatic pruning and stays after import or rejection. Clearing app data or uninstalling removes it; export/backup is not available yet. Older queued records are kept without guessing their local identities; earlier discarded records cannot be recovered.</w:t>
       </w:r>
     </w:p>
     <w:p>
@@ -7261,7 +7266,7 @@
         <w:pStyle w:val="NormalWeb"/>
       </w:pPr>
       <w:r>
-        <w:t>Device players and history shows local results. Atlas import is temporarily paused while explicit linking is added; no same-name account is selected automatically.</w:t>
+        <w:t>Connect the app that kept the game to Atlas (firmware 0.7.2 or later), sign in and explicitly map each player through Device players and history (section 18). Names never select an Atlas account. Pending work can be retried with the same mapping; rejected records stay available with their reason. Import never deletes the local result.</w:t>
       </w:r>
     </w:p>
     <w:p>

</xml_diff>